<commit_message>
Se agregan cambios por medio de pago
</commit_message>
<xml_diff>
--- a/docs/TÉRMINOS Y CONDICIONES DE USO Y COMPRA.docx
+++ b/docs/TÉRMINOS Y CONDICIONES DE USO Y COMPRA.docx
@@ -71,62 +71,125 @@
           <w:sz w:val="20"/>
           <w:szCs w:val="20"/>
         </w:rPr>
-        <w:t>, en adelante "el Sitio</w:t>
-      </w:r>
-      <w:r>
-        <w:rPr>
-          <w:sz w:val="20"/>
-          <w:szCs w:val="20"/>
-        </w:rPr>
-        <w:t>”</w:t>
-      </w:r>
-    </w:p>
-    <w:p>
-      <w:pPr>
-        <w:jc w:val="both"/>
-        <w:rPr>
-          <w:sz w:val="20"/>
-          <w:szCs w:val="20"/>
-        </w:rPr>
-      </w:pPr>
-      <w:r>
-        <w:rPr>
-          <w:sz w:val="20"/>
-          <w:szCs w:val="20"/>
-        </w:rPr>
-        <w:t xml:space="preserve">La aceptación de estos </w:t>
-      </w:r>
-      <w:r>
-        <w:rPr>
-          <w:b/>
-          <w:bCs/>
-          <w:sz w:val="20"/>
-          <w:szCs w:val="20"/>
-        </w:rPr>
-        <w:t>T&amp;C</w:t>
-      </w:r>
-      <w:r>
-        <w:rPr>
-          <w:sz w:val="20"/>
-          <w:szCs w:val="20"/>
-        </w:rPr>
-        <w:t xml:space="preserve"> es un requisito obligatorio para navegar y comprar en este </w:t>
-      </w:r>
-      <w:r>
-        <w:rPr>
-          <w:i/>
-          <w:iCs/>
-          <w:sz w:val="20"/>
-          <w:szCs w:val="20"/>
-        </w:rPr>
-        <w:t>Sitio</w:t>
-      </w:r>
-      <w:r>
-        <w:rPr>
-          <w:sz w:val="20"/>
-          <w:szCs w:val="20"/>
-        </w:rPr>
-        <w:t>.</w:t>
+        <w:t>, en adelante "el Sitio”</w:t>
+      </w:r>
+      <w:r>
+        <w:rPr>
+          <w:sz w:val="20"/>
+          <w:szCs w:val="20"/>
+        </w:rPr>
+        <w:t>, propiedad de</w:t>
+      </w:r>
+      <w:r>
+        <w:rPr>
+          <w:sz w:val="20"/>
+          <w:szCs w:val="20"/>
+        </w:rPr>
+        <w:t xml:space="preserve"> </w:t>
+      </w:r>
+      <w:r>
+        <w:rPr>
+          <w:b/>
+          <w:bCs/>
+          <w:sz w:val="20"/>
+          <w:szCs w:val="20"/>
+        </w:rPr>
+        <w:t>Artesanías Leonello Rodrigo Carrasco Araya EIRL</w:t>
+      </w:r>
+      <w:r>
+        <w:rPr>
+          <w:sz w:val="20"/>
+          <w:szCs w:val="20"/>
+        </w:rPr>
+        <w:t xml:space="preserve">, RUT </w:t>
+      </w:r>
+      <w:r>
+        <w:rPr>
+          <w:b/>
+          <w:bCs/>
+          <w:sz w:val="20"/>
+          <w:szCs w:val="20"/>
+        </w:rPr>
+        <w:t>78.249.272-K</w:t>
+      </w:r>
+      <w:r>
+        <w:rPr>
+          <w:sz w:val="20"/>
+          <w:szCs w:val="20"/>
+        </w:rPr>
+        <w:t>, domiciliada para estos</w:t>
+      </w:r>
+      <w:r>
+        <w:rPr>
+          <w:sz w:val="20"/>
+          <w:szCs w:val="20"/>
+        </w:rPr>
+        <w:t xml:space="preserve"> </w:t>
+      </w:r>
+      <w:r>
+        <w:rPr>
+          <w:sz w:val="20"/>
+          <w:szCs w:val="20"/>
+        </w:rPr>
+        <w:t>efectos en la comuna de San Bernardo, Región Metropolitana, Chile.</w:t>
+      </w:r>
+    </w:p>
+    <w:p>
+      <w:pPr>
+        <w:jc w:val="both"/>
+        <w:rPr>
+          <w:sz w:val="20"/>
+          <w:szCs w:val="20"/>
+        </w:rPr>
+      </w:pPr>
+      <w:r>
+        <w:rPr>
+          <w:sz w:val="20"/>
+          <w:szCs w:val="20"/>
+        </w:rPr>
+        <w:t>Cualquier transacción realizada en el Sitio está sujeta a las leyes de la República de Chile, en</w:t>
+      </w:r>
+      <w:r>
+        <w:rPr>
+          <w:sz w:val="20"/>
+          <w:szCs w:val="20"/>
+        </w:rPr>
+        <w:t xml:space="preserve"> </w:t>
+      </w:r>
+      <w:r>
+        <w:rPr>
+          <w:sz w:val="20"/>
+          <w:szCs w:val="20"/>
+        </w:rPr>
+        <w:t>especial a la Ley N°19.496 sobre Protección de los Derechos de los Consumidores y el</w:t>
+      </w:r>
+      <w:r>
+        <w:rPr>
+          <w:sz w:val="20"/>
+          <w:szCs w:val="20"/>
+        </w:rPr>
+        <w:t xml:space="preserve"> </w:t>
+      </w:r>
+      <w:r>
+        <w:rPr>
+          <w:sz w:val="20"/>
+          <w:szCs w:val="20"/>
+        </w:rPr>
+        <w:t>Reglamento de Comercio Electrónico del SERNAC. La aceptación de estos T&amp;C es un</w:t>
+      </w:r>
+      <w:r>
+        <w:rPr>
+          <w:sz w:val="20"/>
+          <w:szCs w:val="20"/>
+        </w:rPr>
+        <w:t xml:space="preserve"> </w:t>
+      </w:r>
+      <w:r>
+        <w:rPr>
+          <w:sz w:val="20"/>
+          <w:szCs w:val="20"/>
+        </w:rPr>
+        <w:t>requisito obligatorio para navegar y comprar en este Sitio.</w:t>
       </w:r>
     </w:p>
     <w:p>
@@ -319,35 +382,7 @@
           <w:sz w:val="20"/>
           <w:szCs w:val="20"/>
         </w:rPr>
-        <w:t xml:space="preserve"> corresponden al valor total del producto. No incluyen los costos de envío, los cuales serán detallados al momento de </w:t>
-      </w:r>
-      <w:r>
-        <w:rPr>
-          <w:sz w:val="20"/>
-          <w:szCs w:val="20"/>
-        </w:rPr>
-        <w:t>enviar</w:t>
-      </w:r>
-      <w:r>
-        <w:rPr>
-          <w:sz w:val="20"/>
-          <w:szCs w:val="20"/>
-        </w:rPr>
-        <w:t xml:space="preserve"> la dirección de despacho </w:t>
-      </w:r>
-      <w:r>
-        <w:rPr>
-          <w:sz w:val="20"/>
-          <w:szCs w:val="20"/>
-        </w:rPr>
-        <w:t>al momento de realizar la cotización del producto</w:t>
-      </w:r>
-      <w:r>
-        <w:rPr>
-          <w:sz w:val="20"/>
-          <w:szCs w:val="20"/>
-        </w:rPr>
-        <w:t>.</w:t>
+        <w:t xml:space="preserve"> corresponden al valor total del producto. No incluyen los costos de envío, los cuales serán detallados al momento de enviar la dirección de despacho al momento de realizar la cotización del producto.</w:t>
       </w:r>
     </w:p>
     <w:p>
@@ -394,28 +429,7 @@
           <w:sz w:val="20"/>
           <w:szCs w:val="20"/>
         </w:rPr>
-        <w:t xml:space="preserve"> contactará de inmediato al comprador vía WhatsApp o email para ofrecer una alternativa o proceder a la </w:t>
-      </w:r>
-      <w:r>
-        <w:rPr>
-          <w:sz w:val="20"/>
-          <w:szCs w:val="20"/>
-        </w:rPr>
-        <w:t xml:space="preserve">cancelación del pedido y </w:t>
-      </w:r>
-      <w:r>
-        <w:rPr>
-          <w:sz w:val="20"/>
-          <w:szCs w:val="20"/>
-        </w:rPr>
-        <w:t>devolución del dinero</w:t>
-      </w:r>
-      <w:r>
-        <w:rPr>
-          <w:sz w:val="20"/>
-          <w:szCs w:val="20"/>
-        </w:rPr>
-        <w:t xml:space="preserve"> en caso de ser necesario.</w:t>
+        <w:t xml:space="preserve"> contactará de inmediato al comprador vía WhatsApp o email para ofrecer una alternativa o proceder a la cancelación del pedido y devolución del dinero en caso de ser necesario.</w:t>
       </w:r>
     </w:p>
     <w:p>
@@ -455,21 +469,37 @@
           <w:sz w:val="20"/>
           <w:szCs w:val="20"/>
         </w:rPr>
-        <w:t xml:space="preserve">Los pagos se realizarán </w:t>
-      </w:r>
-      <w:r>
-        <w:rPr>
-          <w:sz w:val="20"/>
-          <w:szCs w:val="20"/>
-        </w:rPr>
-        <w:t xml:space="preserve">mediante </w:t>
-      </w:r>
-      <w:r>
-        <w:rPr>
-          <w:sz w:val="20"/>
-          <w:szCs w:val="20"/>
-        </w:rPr>
-        <w:t>transferencia bancaria directa.</w:t>
+        <w:t>Los pagos se realizarán mediante las pasarelas de pago autorizadas y desplegadas en</w:t>
+      </w:r>
+      <w:r>
+        <w:rPr>
+          <w:sz w:val="20"/>
+          <w:szCs w:val="20"/>
+        </w:rPr>
+        <w:t xml:space="preserve"> </w:t>
+      </w:r>
+      <w:r>
+        <w:rPr>
+          <w:sz w:val="20"/>
+          <w:szCs w:val="20"/>
+        </w:rPr>
+        <w:t xml:space="preserve">el Sitio (ej. Webpay, Flow, </w:t>
+      </w:r>
+      <w:proofErr w:type="spellStart"/>
+      <w:r>
+        <w:rPr>
+          <w:sz w:val="20"/>
+          <w:szCs w:val="20"/>
+        </w:rPr>
+        <w:t>MercadoPago</w:t>
+      </w:r>
+      <w:proofErr w:type="spellEnd"/>
+      <w:r>
+        <w:rPr>
+          <w:sz w:val="20"/>
+          <w:szCs w:val="20"/>
+        </w:rPr>
+        <w:t xml:space="preserve"> o transferencia bancaria directa).</w:t>
       </w:r>
     </w:p>
     <w:p>
@@ -480,6 +510,8 @@
         </w:numPr>
         <w:jc w:val="both"/>
         <w:rPr>
+          <w:b/>
+          <w:bCs/>
           <w:sz w:val="20"/>
           <w:szCs w:val="20"/>
         </w:rPr>
@@ -507,56 +539,101 @@
           <w:sz w:val="20"/>
           <w:szCs w:val="20"/>
         </w:rPr>
-        <w:t xml:space="preserve"> enviará una confirmación escrita d</w:t>
-      </w:r>
-      <w:r>
-        <w:rPr>
-          <w:sz w:val="20"/>
-          <w:szCs w:val="20"/>
-        </w:rPr>
-        <w:t>el recibo del pago al medio de contacto</w:t>
-      </w:r>
-      <w:r>
-        <w:rPr>
-          <w:sz w:val="20"/>
-          <w:szCs w:val="20"/>
-        </w:rPr>
-        <w:t xml:space="preserve"> registrado por el </w:t>
-      </w:r>
-      <w:r>
-        <w:rPr>
-          <w:i/>
-          <w:iCs/>
-          <w:sz w:val="20"/>
-          <w:szCs w:val="20"/>
-        </w:rPr>
-        <w:t>Cliente</w:t>
-      </w:r>
-      <w:r>
-        <w:rPr>
-          <w:sz w:val="20"/>
-          <w:szCs w:val="20"/>
-        </w:rPr>
-        <w:t>. El consentimiento entre las partes se entenderá formalizado solo tras el envío de dicha confirmación.</w:t>
-      </w:r>
-    </w:p>
-    <w:p>
-      <w:pPr>
-        <w:jc w:val="both"/>
-        <w:rPr>
-          <w:b/>
-          <w:bCs/>
-          <w:sz w:val="20"/>
-          <w:szCs w:val="20"/>
-        </w:rPr>
-      </w:pPr>
-      <w:r>
-        <w:rPr>
-          <w:b/>
-          <w:bCs/>
-          <w:sz w:val="20"/>
-          <w:szCs w:val="20"/>
-        </w:rPr>
+        <w:t xml:space="preserve"> enviará una confirmación escrita del</w:t>
+      </w:r>
+      <w:r>
+        <w:rPr>
+          <w:sz w:val="20"/>
+          <w:szCs w:val="20"/>
+        </w:rPr>
+        <w:t xml:space="preserve"> </w:t>
+      </w:r>
+      <w:r>
+        <w:rPr>
+          <w:sz w:val="20"/>
+          <w:szCs w:val="20"/>
+        </w:rPr>
+        <w:t>contrato al correo electrónico registrado por el Cliente, adjuntando el detalle del</w:t>
+      </w:r>
+      <w:r>
+        <w:rPr>
+          <w:sz w:val="20"/>
+          <w:szCs w:val="20"/>
+        </w:rPr>
+        <w:t xml:space="preserve"> </w:t>
+      </w:r>
+      <w:r>
+        <w:rPr>
+          <w:sz w:val="20"/>
+          <w:szCs w:val="20"/>
+        </w:rPr>
+        <w:t>pedido y la boleta respectiva. El consentimiento entre las partes se entenderá</w:t>
+      </w:r>
+      <w:r>
+        <w:rPr>
+          <w:sz w:val="20"/>
+          <w:szCs w:val="20"/>
+        </w:rPr>
+        <w:t xml:space="preserve"> </w:t>
+      </w:r>
+      <w:r>
+        <w:rPr>
+          <w:sz w:val="20"/>
+          <w:szCs w:val="20"/>
+        </w:rPr>
+        <w:t>formalizado solo tras el envío de dicha confirmación.</w:t>
+      </w:r>
+    </w:p>
+    <w:p>
+      <w:pPr>
+        <w:ind w:left="720"/>
+        <w:jc w:val="both"/>
+        <w:rPr>
+          <w:sz w:val="20"/>
+          <w:szCs w:val="20"/>
+        </w:rPr>
+      </w:pPr>
+    </w:p>
+    <w:p>
+      <w:pPr>
+        <w:ind w:left="720"/>
+        <w:jc w:val="both"/>
+        <w:rPr>
+          <w:sz w:val="20"/>
+          <w:szCs w:val="20"/>
+        </w:rPr>
+      </w:pPr>
+    </w:p>
+    <w:p>
+      <w:pPr>
+        <w:ind w:left="720"/>
+        <w:jc w:val="both"/>
+        <w:rPr>
+          <w:b/>
+          <w:bCs/>
+          <w:sz w:val="20"/>
+          <w:szCs w:val="20"/>
+        </w:rPr>
+      </w:pPr>
+    </w:p>
+    <w:p>
+      <w:pPr>
+        <w:jc w:val="both"/>
+        <w:rPr>
+          <w:b/>
+          <w:bCs/>
+          <w:sz w:val="20"/>
+          <w:szCs w:val="20"/>
+        </w:rPr>
+      </w:pPr>
+      <w:r>
+        <w:rPr>
+          <w:b/>
+          <w:bCs/>
+          <w:sz w:val="20"/>
+          <w:szCs w:val="20"/>
+        </w:rPr>
+        <w:lastRenderedPageBreak/>
         <w:t>5. Políticas de Despacho y Envío</w:t>
       </w:r>
     </w:p>
@@ -663,21 +740,7 @@
           <w:sz w:val="20"/>
           <w:szCs w:val="20"/>
         </w:rPr>
-        <w:t xml:space="preserve"> </w:t>
-      </w:r>
-      <w:r>
-        <w:rPr>
-          <w:sz w:val="20"/>
-          <w:szCs w:val="20"/>
-        </w:rPr>
-        <w:t>entregar</w:t>
-      </w:r>
-      <w:r>
-        <w:rPr>
-          <w:sz w:val="20"/>
-          <w:szCs w:val="20"/>
-        </w:rPr>
-        <w:t xml:space="preserve"> la dirección de despacho de manera correcta y completa. </w:t>
+        <w:t xml:space="preserve"> entregar la dirección de despacho de manera correcta y completa. </w:t>
       </w:r>
       <w:proofErr w:type="spellStart"/>
       <w:r>
@@ -700,34 +763,82 @@
     </w:p>
     <w:p>
       <w:pPr>
-        <w:ind w:left="720"/>
-        <w:jc w:val="both"/>
-        <w:rPr>
-          <w:sz w:val="20"/>
-          <w:szCs w:val="20"/>
-          <w:u w:val="single"/>
-        </w:rPr>
-      </w:pPr>
-    </w:p>
-    <w:p>
-      <w:pPr>
-        <w:jc w:val="both"/>
-        <w:rPr>
-          <w:b/>
-          <w:bCs/>
-          <w:sz w:val="20"/>
-          <w:szCs w:val="20"/>
-        </w:rPr>
-      </w:pPr>
-      <w:r>
-        <w:rPr>
-          <w:b/>
-          <w:bCs/>
-          <w:sz w:val="20"/>
-          <w:szCs w:val="20"/>
-        </w:rPr>
-        <w:lastRenderedPageBreak/>
+        <w:jc w:val="both"/>
+        <w:rPr>
+          <w:b/>
+          <w:bCs/>
+          <w:sz w:val="20"/>
+          <w:szCs w:val="20"/>
+        </w:rPr>
+      </w:pPr>
+      <w:r>
+        <w:rPr>
+          <w:b/>
+          <w:bCs/>
+          <w:sz w:val="20"/>
+          <w:szCs w:val="20"/>
+        </w:rPr>
         <w:t>6. Derecho de Retracto</w:t>
+      </w:r>
+    </w:p>
+    <w:p>
+      <w:pPr>
+        <w:jc w:val="both"/>
+        <w:rPr>
+          <w:sz w:val="20"/>
+          <w:szCs w:val="20"/>
+        </w:rPr>
+      </w:pPr>
+      <w:r>
+        <w:rPr>
+          <w:sz w:val="20"/>
+          <w:szCs w:val="20"/>
+        </w:rPr>
+        <w:t xml:space="preserve">Conforme al artículo 3 bis letra b de la Ley </w:t>
+      </w:r>
+      <w:proofErr w:type="spellStart"/>
+      <w:r>
+        <w:rPr>
+          <w:sz w:val="20"/>
+          <w:szCs w:val="20"/>
+        </w:rPr>
+        <w:t>N°</w:t>
+      </w:r>
+      <w:proofErr w:type="spellEnd"/>
+      <w:r>
+        <w:rPr>
+          <w:sz w:val="20"/>
+          <w:szCs w:val="20"/>
+        </w:rPr>
+        <w:t xml:space="preserve"> 19.496, el consumidor tiene derecho a</w:t>
+      </w:r>
+      <w:r>
+        <w:rPr>
+          <w:sz w:val="20"/>
+          <w:szCs w:val="20"/>
+        </w:rPr>
+        <w:t xml:space="preserve"> </w:t>
+      </w:r>
+      <w:r>
+        <w:rPr>
+          <w:sz w:val="20"/>
+          <w:szCs w:val="20"/>
+        </w:rPr>
+        <w:t>retractarse de las compras realizadas a través de medios electrónicos dentro del plazo de 10</w:t>
+      </w:r>
+      <w:r>
+        <w:rPr>
+          <w:sz w:val="20"/>
+          <w:szCs w:val="20"/>
+        </w:rPr>
+        <w:t xml:space="preserve"> </w:t>
+      </w:r>
+      <w:r>
+        <w:rPr>
+          <w:sz w:val="20"/>
+          <w:szCs w:val="20"/>
+        </w:rPr>
+        <w:t>días contados desde la recepción del producto.</w:t>
       </w:r>
     </w:p>
     <w:p>
@@ -756,14 +867,14 @@
           <w:sz w:val="20"/>
           <w:szCs w:val="20"/>
         </w:rPr>
-        <w:t>: De acuerdo con la normativa del</w:t>
-      </w:r>
-      <w:r>
-        <w:rPr>
-          <w:sz w:val="20"/>
-          <w:szCs w:val="20"/>
-        </w:rPr>
-        <w:t xml:space="preserve"> SERNAC</w:t>
+        <w:t>: De acuerdo con la normativa del SERNAC</w:t>
+      </w:r>
+      <w:r>
+        <w:rPr>
+          <w:sz w:val="20"/>
+          <w:szCs w:val="20"/>
+        </w:rPr>
+        <w:t xml:space="preserve"> en Comercio Electrónico</w:t>
       </w:r>
       <w:r>
         <w:rPr>
@@ -867,21 +978,7 @@
           <w:sz w:val="20"/>
           <w:szCs w:val="20"/>
         </w:rPr>
-        <w:t xml:space="preserve"> tiene derecho a la garantía establecida por </w:t>
-      </w:r>
-      <w:r>
-        <w:rPr>
-          <w:sz w:val="20"/>
-          <w:szCs w:val="20"/>
-        </w:rPr>
-        <w:t>SERNAC</w:t>
-      </w:r>
-      <w:r>
-        <w:rPr>
-          <w:sz w:val="20"/>
-          <w:szCs w:val="20"/>
-        </w:rPr>
-        <w:t xml:space="preserve">. Esto le permite optar, dentro de los </w:t>
+        <w:t xml:space="preserve"> tiene derecho a la garantía establecida por SERNAC. Esto le permite optar, dentro de los </w:t>
       </w:r>
       <w:r>
         <w:rPr>
@@ -1007,21 +1104,7 @@
           <w:sz w:val="20"/>
           <w:szCs w:val="20"/>
         </w:rPr>
-        <w:t xml:space="preserve"> a través de sus canales oficiales de atención (WhatsApp o correo electrónico) aportando el comprobante de compra o boleta</w:t>
-      </w:r>
-      <w:r>
-        <w:rPr>
-          <w:sz w:val="20"/>
-          <w:szCs w:val="20"/>
-        </w:rPr>
-        <w:t xml:space="preserve"> y los detalles del motivo del reclamo</w:t>
-      </w:r>
-      <w:r>
-        <w:rPr>
-          <w:sz w:val="20"/>
-          <w:szCs w:val="20"/>
-        </w:rPr>
-        <w:t>.</w:t>
+        <w:t xml:space="preserve"> a través de sus canales oficiales de atención (WhatsApp o correo electrónico) aportando el comprobante de compra o boleta y los detalles del motivo del reclamo.</w:t>
       </w:r>
     </w:p>
     <w:p>
@@ -1082,19 +1165,38 @@
       <w:pPr>
         <w:jc w:val="both"/>
         <w:rPr>
-          <w:b/>
-          <w:bCs/>
-          <w:sz w:val="20"/>
-          <w:szCs w:val="20"/>
-        </w:rPr>
-      </w:pPr>
-      <w:r>
-        <w:rPr>
-          <w:b/>
-          <w:bCs/>
-          <w:sz w:val="20"/>
-          <w:szCs w:val="20"/>
-        </w:rPr>
+          <w:sz w:val="20"/>
+          <w:szCs w:val="20"/>
+        </w:rPr>
+      </w:pPr>
+    </w:p>
+    <w:p>
+      <w:pPr>
+        <w:jc w:val="both"/>
+        <w:rPr>
+          <w:sz w:val="20"/>
+          <w:szCs w:val="20"/>
+        </w:rPr>
+      </w:pPr>
+    </w:p>
+    <w:p>
+      <w:pPr>
+        <w:jc w:val="both"/>
+        <w:rPr>
+          <w:b/>
+          <w:bCs/>
+          <w:sz w:val="20"/>
+          <w:szCs w:val="20"/>
+        </w:rPr>
+      </w:pPr>
+      <w:r>
+        <w:rPr>
+          <w:b/>
+          <w:bCs/>
+          <w:sz w:val="20"/>
+          <w:szCs w:val="20"/>
+        </w:rPr>
+        <w:lastRenderedPageBreak/>
         <w:t>9. Protección de Datos Personales</w:t>
       </w:r>
     </w:p>
@@ -1165,14 +1267,7 @@
           <w:sz w:val="20"/>
           <w:szCs w:val="20"/>
         </w:rPr>
-        <w:t xml:space="preserve">Para cualquier duda, reclamo o gestión postventa, los usuarios pueden comunicarse de manera directa a través de </w:t>
-      </w:r>
-      <w:r>
-        <w:rPr>
-          <w:sz w:val="20"/>
-          <w:szCs w:val="20"/>
-        </w:rPr>
-        <w:t>la sección</w:t>
+        <w:t>Para cualquier duda, reclamo o gestión postventa, los usuarios pueden comunicarse de manera directa a través de la sección</w:t>
       </w:r>
       <w:r>
         <w:rPr>

</xml_diff>